<commit_message>
Code cleaning + logging. Future work: 1) Move some functions from server and client to separated classes 2) Error handling 3) Server state answer handling
</commit_message>
<xml_diff>
--- a/DB/Lab3/Лаба3.docx
+++ b/DB/Lab3/Лаба3.docx
@@ -1118,25 +1118,7 @@
           <w:sz w:val="26"/>
           <w:szCs w:val="26"/>
         </w:rPr>
-        <w:t xml:space="preserve">Приведите отношения в 3NF (как минимум). Постройте схему на </w:t>
-      </w:r>
-      <w:proofErr w:type="spellStart"/>
-      <w:r>
-        <w:rPr>
-          <w:rFonts w:ascii="Times New Roman" w:hAnsi="Times New Roman" w:cs="Times New Roman"/>
-          <w:sz w:val="26"/>
-          <w:szCs w:val="26"/>
-        </w:rPr>
-        <w:t>основеNF</w:t>
-      </w:r>
-      <w:proofErr w:type="spellEnd"/>
-      <w:r>
-        <w:rPr>
-          <w:rFonts w:ascii="Times New Roman" w:hAnsi="Times New Roman" w:cs="Times New Roman"/>
-          <w:sz w:val="26"/>
-          <w:szCs w:val="26"/>
-        </w:rPr>
-        <w:t xml:space="preserve"> (как минимум). </w:t>
+        <w:t>Приведите отношения в 3NF (как минимум). Постройте схему на основеNF (как минимум). </w:t>
       </w:r>
     </w:p>
     <w:p>
@@ -1164,25 +1146,7 @@
           <w:sz w:val="26"/>
           <w:szCs w:val="26"/>
         </w:rPr>
-        <w:t xml:space="preserve">Опишите изменения в функциональных зависимостях, произошедшие после преобразования в 3NF (как минимум). Постройте схему на </w:t>
-      </w:r>
-      <w:proofErr w:type="spellStart"/>
-      <w:r>
-        <w:rPr>
-          <w:rFonts w:ascii="Times New Roman" w:hAnsi="Times New Roman" w:cs="Times New Roman"/>
-          <w:sz w:val="26"/>
-          <w:szCs w:val="26"/>
-        </w:rPr>
-        <w:t>основеNF</w:t>
-      </w:r>
-      <w:proofErr w:type="spellEnd"/>
-      <w:r>
-        <w:rPr>
-          <w:rFonts w:ascii="Times New Roman" w:hAnsi="Times New Roman" w:cs="Times New Roman"/>
-          <w:sz w:val="26"/>
-          <w:szCs w:val="26"/>
-        </w:rPr>
-        <w:t>;</w:t>
+        <w:t>Опишите изменения в функциональных зависимостях, произошедшие после преобразования в 3NF (как минимум). Постройте схему на основеNF;</w:t>
       </w:r>
     </w:p>
     <w:p>
@@ -1238,25 +1202,7 @@
           <w:sz w:val="26"/>
           <w:szCs w:val="26"/>
         </w:rPr>
-        <w:t xml:space="preserve">Какие </w:t>
-      </w:r>
-      <w:proofErr w:type="spellStart"/>
-      <w:r>
-        <w:rPr>
-          <w:rFonts w:ascii="Times New Roman" w:hAnsi="Times New Roman" w:cs="Times New Roman"/>
-          <w:sz w:val="26"/>
-          <w:szCs w:val="26"/>
-        </w:rPr>
-        <w:t>денормализации</w:t>
-      </w:r>
-      <w:proofErr w:type="spellEnd"/>
-      <w:r>
-        <w:rPr>
-          <w:rFonts w:ascii="Times New Roman" w:hAnsi="Times New Roman" w:cs="Times New Roman"/>
-          <w:sz w:val="26"/>
-          <w:szCs w:val="26"/>
-        </w:rPr>
-        <w:t xml:space="preserve"> будут полезны для вашей схемы? Приведите подробное описание.</w:t>
+        <w:t>Какие денормализации будут полезны для вашей схемы? Приведите подробное описание.</w:t>
       </w:r>
     </w:p>
     <w:p>
@@ -1284,25 +1230,7 @@
           <w:sz w:val="26"/>
           <w:szCs w:val="26"/>
         </w:rPr>
-        <w:t>Придумайте триггер и связанную с ним функцию, относящиеся к вашей предметной области, согласуйте их с преподавателем и реализуйте на языке PL/</w:t>
-      </w:r>
-      <w:proofErr w:type="spellStart"/>
-      <w:r>
-        <w:rPr>
-          <w:rFonts w:ascii="Times New Roman" w:hAnsi="Times New Roman" w:cs="Times New Roman"/>
-          <w:sz w:val="26"/>
-          <w:szCs w:val="26"/>
-        </w:rPr>
-        <w:t>pgSQL</w:t>
-      </w:r>
-      <w:proofErr w:type="spellEnd"/>
-      <w:r>
-        <w:rPr>
-          <w:rFonts w:ascii="Times New Roman" w:hAnsi="Times New Roman" w:cs="Times New Roman"/>
-          <w:sz w:val="26"/>
-          <w:szCs w:val="26"/>
-        </w:rPr>
-        <w:t>.</w:t>
+        <w:t>Придумайте триггер и связанную с ним функцию, относящиеся к вашей предметной области, согласуйте их с преподавателем и реализуйте на языке PL/pgSQL.</w:t>
       </w:r>
     </w:p>
     <w:p>
@@ -1310,14 +1238,12 @@
         <w:pStyle w:val="a3"/>
         <w:rPr>
           <w:rStyle w:val="af4"/>
-          <w:highlight w:val="yellow"/>
         </w:rPr>
       </w:pPr>
       <w:bookmarkStart w:id="1" w:name="_Toc224731233"/>
       <w:r>
         <w:rPr>
           <w:rStyle w:val="af4"/>
-          <w:highlight w:val="yellow"/>
         </w:rPr>
         <w:t>Описание предметной области</w:t>
       </w:r>
@@ -1332,7 +1258,6 @@
           <w:iCs/>
           <w:sz w:val="26"/>
           <w:szCs w:val="26"/>
-          <w:highlight w:val="yellow"/>
         </w:rPr>
       </w:pPr>
       <w:r>
@@ -1342,7 +1267,6 @@
           <w:iCs/>
           <w:sz w:val="26"/>
           <w:szCs w:val="26"/>
-          <w:highlight w:val="yellow"/>
         </w:rPr>
         <w:t xml:space="preserve">Парадоксально, но </w:t>
       </w:r>
@@ -1355,7 +1279,6 @@
           <w:iCs/>
           <w:sz w:val="26"/>
           <w:szCs w:val="26"/>
-          <w:highlight w:val="yellow"/>
         </w:rPr>
         <w:t>он</w:t>
       </w:r>
@@ -1368,7 +1291,6 @@
           <w:iCs/>
           <w:sz w:val="26"/>
           <w:szCs w:val="26"/>
-          <w:highlight w:val="yellow"/>
         </w:rPr>
         <w:t>(персонаж)</w:t>
       </w:r>
@@ -1381,7 +1303,6 @@
           <w:iCs/>
           <w:sz w:val="26"/>
           <w:szCs w:val="26"/>
-          <w:highlight w:val="yellow"/>
         </w:rPr>
         <w:t xml:space="preserve"> испугал</w:t>
       </w:r>
@@ -1394,7 +1315,6 @@
           <w:iCs/>
           <w:sz w:val="26"/>
           <w:szCs w:val="26"/>
-          <w:highlight w:val="yellow"/>
         </w:rPr>
         <w:t>(эмоция)</w:t>
       </w:r>
@@ -1405,7 +1325,6 @@
           <w:iCs/>
           <w:sz w:val="26"/>
           <w:szCs w:val="26"/>
-          <w:highlight w:val="yellow"/>
         </w:rPr>
         <w:t xml:space="preserve"> нас одновременно и </w:t>
       </w:r>
@@ -1416,7 +1335,6 @@
           <w:iCs/>
           <w:sz w:val="26"/>
           <w:szCs w:val="26"/>
-          <w:highlight w:val="yellow"/>
         </w:rPr>
         <w:t>больше,</w:t>
       </w:r>
@@ -1427,7 +1345,6 @@
           <w:iCs/>
           <w:sz w:val="26"/>
           <w:szCs w:val="26"/>
-          <w:highlight w:val="yellow"/>
         </w:rPr>
         <w:t xml:space="preserve"> и меньше предыдущего: сам по себе он был вполне зауряден, но </w:t>
       </w:r>
@@ -1440,7 +1357,6 @@
           <w:iCs/>
           <w:sz w:val="26"/>
           <w:szCs w:val="26"/>
-          <w:highlight w:val="yellow"/>
         </w:rPr>
         <w:t xml:space="preserve">с учетом </w:t>
       </w:r>
@@ -1453,7 +1369,6 @@
           <w:iCs/>
           <w:sz w:val="26"/>
           <w:szCs w:val="26"/>
-          <w:highlight w:val="yellow"/>
         </w:rPr>
         <w:t>места (координаты, наименование)</w:t>
       </w:r>
@@ -1466,7 +1381,6 @@
           <w:iCs/>
           <w:sz w:val="26"/>
           <w:szCs w:val="26"/>
-          <w:highlight w:val="yellow"/>
         </w:rPr>
         <w:t xml:space="preserve"> и </w:t>
       </w:r>
@@ -1479,7 +1393,6 @@
           <w:iCs/>
           <w:sz w:val="26"/>
           <w:szCs w:val="26"/>
-          <w:highlight w:val="yellow"/>
         </w:rPr>
         <w:t>обстоятельств (место, время)</w:t>
       </w:r>
@@ -1490,7 +1403,6 @@
           <w:iCs/>
           <w:sz w:val="26"/>
           <w:szCs w:val="26"/>
-          <w:highlight w:val="yellow"/>
         </w:rPr>
         <w:t xml:space="preserve"> -- невозможен, а потому </w:t>
       </w:r>
@@ -1503,7 +1415,6 @@
           <w:iCs/>
           <w:sz w:val="26"/>
           <w:szCs w:val="26"/>
-          <w:highlight w:val="yellow"/>
         </w:rPr>
         <w:t>заставил нас похолодеть от страха</w:t>
       </w:r>
@@ -1514,7 +1425,6 @@
           <w:iCs/>
           <w:sz w:val="26"/>
           <w:szCs w:val="26"/>
-          <w:highlight w:val="yellow"/>
         </w:rPr>
         <w:t xml:space="preserve">. </w:t>
       </w:r>
@@ -1527,7 +1437,6 @@
           <w:iCs/>
           <w:sz w:val="26"/>
           <w:szCs w:val="26"/>
-          <w:highlight w:val="yellow"/>
         </w:rPr>
         <w:t xml:space="preserve">Ведь пахло не чем иным, как </w:t>
       </w:r>
@@ -1540,7 +1449,6 @@
           <w:iCs/>
           <w:sz w:val="26"/>
           <w:szCs w:val="26"/>
-          <w:highlight w:val="yellow"/>
         </w:rPr>
         <w:t xml:space="preserve">бензином (объект </w:t>
       </w:r>
@@ -1553,7 +1461,6 @@
           <w:iCs/>
           <w:sz w:val="26"/>
           <w:szCs w:val="26"/>
-          <w:highlight w:val="yellow"/>
         </w:rPr>
         <w:t>места</w:t>
       </w:r>
@@ -1566,7 +1473,6 @@
           <w:iCs/>
           <w:sz w:val="26"/>
           <w:szCs w:val="26"/>
-          <w:highlight w:val="yellow"/>
         </w:rPr>
         <w:t>)</w:t>
       </w:r>
@@ -1577,7 +1483,6 @@
           <w:iCs/>
           <w:sz w:val="26"/>
           <w:szCs w:val="26"/>
-          <w:highlight w:val="yellow"/>
         </w:rPr>
         <w:t xml:space="preserve">. Единственное, что </w:t>
       </w:r>
@@ -1590,7 +1495,6 @@
           <w:iCs/>
           <w:sz w:val="26"/>
           <w:szCs w:val="26"/>
-          <w:highlight w:val="yellow"/>
         </w:rPr>
         <w:t>приходило на ум</w:t>
       </w:r>
@@ -1603,7 +1507,6 @@
           <w:iCs/>
           <w:sz w:val="26"/>
           <w:szCs w:val="26"/>
-          <w:highlight w:val="yellow"/>
         </w:rPr>
         <w:t>(мысль)</w:t>
       </w:r>
@@ -1614,23 +1517,32 @@
           <w:iCs/>
           <w:sz w:val="26"/>
           <w:szCs w:val="26"/>
-          <w:highlight w:val="yellow"/>
-        </w:rPr>
-        <w:t xml:space="preserve">, не связано ли это как-то с </w:t>
-      </w:r>
-      <w:proofErr w:type="spellStart"/>
-      <w:r>
+        </w:rPr>
+        <w:t>, не связано ли это как-то с Гедни.</w:t>
+      </w:r>
+    </w:p>
+    <w:p>
+      <w:pPr>
+        <w:pStyle w:val="a5"/>
+      </w:pPr>
+      <w:bookmarkStart w:id="2" w:name="_Toc224731234"/>
+      <w:r>
+        <w:t>Классификация сущностей</w:t>
+      </w:r>
+      <w:bookmarkEnd w:id="2"/>
+    </w:p>
+    <w:p>
+      <w:pPr>
+        <w:spacing w:after="0"/>
+        <w:jc w:val="both"/>
         <w:rPr>
           <w:rFonts w:ascii="Times New Roman" w:hAnsi="Times New Roman" w:cs="Times New Roman"/>
           <w:i/>
           <w:iCs/>
           <w:sz w:val="26"/>
           <w:szCs w:val="26"/>
-          <w:highlight w:val="yellow"/>
-        </w:rPr>
-        <w:t>Гедни</w:t>
-      </w:r>
-      <w:proofErr w:type="spellEnd"/>
+        </w:rPr>
+      </w:pPr>
       <w:r>
         <w:rPr>
           <w:rFonts w:ascii="Times New Roman" w:hAnsi="Times New Roman" w:cs="Times New Roman"/>
@@ -1638,59 +1550,16 @@
           <w:iCs/>
           <w:sz w:val="26"/>
           <w:szCs w:val="26"/>
-          <w:highlight w:val="yellow"/>
-        </w:rPr>
-        <w:t>.</w:t>
-      </w:r>
-    </w:p>
-    <w:p>
-      <w:pPr>
-        <w:pStyle w:val="a5"/>
-        <w:rPr>
-          <w:highlight w:val="yellow"/>
-        </w:rPr>
-      </w:pPr>
-      <w:bookmarkStart w:id="2" w:name="_Toc224731234"/>
-      <w:r>
-        <w:rPr>
-          <w:highlight w:val="yellow"/>
-        </w:rPr>
-        <w:t>Классификация сущностей</w:t>
-      </w:r>
-      <w:bookmarkEnd w:id="2"/>
-    </w:p>
-    <w:p>
-      <w:pPr>
-        <w:spacing w:after="0"/>
-        <w:jc w:val="both"/>
+        </w:rPr>
+        <w:t>Стержневые</w:t>
+      </w:r>
+      <w:r>
         <w:rPr>
           <w:rFonts w:ascii="Times New Roman" w:hAnsi="Times New Roman" w:cs="Times New Roman"/>
           <w:i/>
           <w:iCs/>
           <w:sz w:val="26"/>
           <w:szCs w:val="26"/>
-          <w:highlight w:val="yellow"/>
-        </w:rPr>
-      </w:pPr>
-      <w:r>
-        <w:rPr>
-          <w:rFonts w:ascii="Times New Roman" w:hAnsi="Times New Roman" w:cs="Times New Roman"/>
-          <w:i/>
-          <w:iCs/>
-          <w:sz w:val="26"/>
-          <w:szCs w:val="26"/>
-          <w:highlight w:val="yellow"/>
-        </w:rPr>
-        <w:t>Стержневые</w:t>
-      </w:r>
-      <w:r>
-        <w:rPr>
-          <w:rFonts w:ascii="Times New Roman" w:hAnsi="Times New Roman" w:cs="Times New Roman"/>
-          <w:i/>
-          <w:iCs/>
-          <w:sz w:val="26"/>
-          <w:szCs w:val="26"/>
-          <w:highlight w:val="yellow"/>
         </w:rPr>
         <w:t xml:space="preserve"> - независимые сущности</w:t>
       </w:r>
@@ -1708,7 +1577,6 @@
           <w:rFonts w:ascii="Times New Roman" w:hAnsi="Times New Roman" w:cs="Times New Roman"/>
           <w:sz w:val="26"/>
           <w:szCs w:val="26"/>
-          <w:highlight w:val="yellow"/>
         </w:rPr>
       </w:pPr>
       <w:r>
@@ -1718,7 +1586,6 @@
           <w:bCs/>
           <w:sz w:val="26"/>
           <w:szCs w:val="26"/>
-          <w:highlight w:val="yellow"/>
         </w:rPr>
         <w:t>Персонаж</w:t>
       </w:r>
@@ -1729,7 +1596,6 @@
           <w:bCs/>
           <w:sz w:val="26"/>
           <w:szCs w:val="26"/>
-          <w:highlight w:val="yellow"/>
         </w:rPr>
         <w:t>:</w:t>
       </w:r>
@@ -1738,7 +1604,6 @@
           <w:rFonts w:ascii="Times New Roman" w:hAnsi="Times New Roman" w:cs="Times New Roman"/>
           <w:sz w:val="26"/>
           <w:szCs w:val="26"/>
-          <w:highlight w:val="yellow"/>
         </w:rPr>
         <w:t xml:space="preserve"> </w:t>
       </w:r>
@@ -1747,7 +1612,6 @@
           <w:rFonts w:ascii="Times New Roman" w:hAnsi="Times New Roman" w:cs="Times New Roman"/>
           <w:sz w:val="26"/>
           <w:szCs w:val="26"/>
-          <w:highlight w:val="yellow"/>
         </w:rPr>
         <w:t>имя, пол, дата рождения</w:t>
       </w:r>
@@ -1765,7 +1629,6 @@
           <w:rFonts w:ascii="Times New Roman" w:hAnsi="Times New Roman" w:cs="Times New Roman"/>
           <w:sz w:val="26"/>
           <w:szCs w:val="26"/>
-          <w:highlight w:val="yellow"/>
         </w:rPr>
       </w:pPr>
       <w:r>
@@ -1775,7 +1638,6 @@
           <w:bCs/>
           <w:sz w:val="26"/>
           <w:szCs w:val="26"/>
-          <w:highlight w:val="yellow"/>
         </w:rPr>
         <w:t>Событие</w:t>
       </w:r>
@@ -1786,7 +1648,6 @@
           <w:bCs/>
           <w:sz w:val="26"/>
           <w:szCs w:val="26"/>
-          <w:highlight w:val="yellow"/>
           <w:lang w:val="en-US"/>
         </w:rPr>
         <w:t>:</w:t>
@@ -1796,7 +1657,6 @@
           <w:rFonts w:ascii="Times New Roman" w:hAnsi="Times New Roman" w:cs="Times New Roman"/>
           <w:sz w:val="26"/>
           <w:szCs w:val="26"/>
-          <w:highlight w:val="yellow"/>
         </w:rPr>
         <w:t xml:space="preserve"> тип, описание</w:t>
       </w:r>
@@ -1816,7 +1676,6 @@
           <w:iCs/>
           <w:sz w:val="26"/>
           <w:szCs w:val="26"/>
-          <w:highlight w:val="yellow"/>
         </w:rPr>
       </w:pPr>
       <w:r>
@@ -1826,7 +1685,6 @@
           <w:bCs/>
           <w:sz w:val="26"/>
           <w:szCs w:val="26"/>
-          <w:highlight w:val="yellow"/>
         </w:rPr>
         <w:t>Место</w:t>
       </w:r>
@@ -1837,7 +1695,6 @@
           <w:bCs/>
           <w:sz w:val="26"/>
           <w:szCs w:val="26"/>
-          <w:highlight w:val="yellow"/>
           <w:lang w:val="en-US"/>
         </w:rPr>
         <w:t>:</w:t>
@@ -1847,7 +1704,6 @@
           <w:rFonts w:ascii="Times New Roman" w:hAnsi="Times New Roman" w:cs="Times New Roman"/>
           <w:sz w:val="26"/>
           <w:szCs w:val="26"/>
-          <w:highlight w:val="yellow"/>
         </w:rPr>
         <w:t xml:space="preserve"> наименование, координаты, описание</w:t>
       </w:r>
@@ -1862,7 +1718,6 @@
           <w:iCs/>
           <w:sz w:val="26"/>
           <w:szCs w:val="26"/>
-          <w:highlight w:val="yellow"/>
         </w:rPr>
       </w:pPr>
       <w:r>
@@ -1872,7 +1727,6 @@
           <w:iCs/>
           <w:sz w:val="26"/>
           <w:szCs w:val="26"/>
-          <w:highlight w:val="yellow"/>
         </w:rPr>
         <w:t>Характеристические</w:t>
       </w:r>
@@ -1883,7 +1737,6 @@
           <w:iCs/>
           <w:sz w:val="26"/>
           <w:szCs w:val="26"/>
-          <w:highlight w:val="yellow"/>
         </w:rPr>
         <w:t xml:space="preserve"> - сущност</w:t>
       </w:r>
@@ -1894,7 +1747,6 @@
           <w:iCs/>
           <w:sz w:val="26"/>
           <w:szCs w:val="26"/>
-          <w:highlight w:val="yellow"/>
         </w:rPr>
         <w:t>и</w:t>
       </w:r>
@@ -1905,7 +1757,6 @@
           <w:iCs/>
           <w:sz w:val="26"/>
           <w:szCs w:val="26"/>
-          <w:highlight w:val="yellow"/>
         </w:rPr>
         <w:t>, описывающ</w:t>
       </w:r>
@@ -1916,7 +1767,6 @@
           <w:iCs/>
           <w:sz w:val="26"/>
           <w:szCs w:val="26"/>
-          <w:highlight w:val="yellow"/>
         </w:rPr>
         <w:t>ие</w:t>
       </w:r>
@@ -1927,7 +1777,6 @@
           <w:iCs/>
           <w:sz w:val="26"/>
           <w:szCs w:val="26"/>
-          <w:highlight w:val="yellow"/>
         </w:rPr>
         <w:t xml:space="preserve"> или уточняющ</w:t>
       </w:r>
@@ -1938,7 +1787,6 @@
           <w:iCs/>
           <w:sz w:val="26"/>
           <w:szCs w:val="26"/>
-          <w:highlight w:val="yellow"/>
         </w:rPr>
         <w:t>ие</w:t>
       </w:r>
@@ -1949,7 +1797,6 @@
           <w:iCs/>
           <w:sz w:val="26"/>
           <w:szCs w:val="26"/>
-          <w:highlight w:val="yellow"/>
         </w:rPr>
         <w:t xml:space="preserve"> друг</w:t>
       </w:r>
@@ -1960,7 +1807,6 @@
           <w:iCs/>
           <w:sz w:val="26"/>
           <w:szCs w:val="26"/>
-          <w:highlight w:val="yellow"/>
         </w:rPr>
         <w:t>ие</w:t>
       </w:r>
@@ -1971,7 +1817,6 @@
           <w:iCs/>
           <w:sz w:val="26"/>
           <w:szCs w:val="26"/>
-          <w:highlight w:val="yellow"/>
         </w:rPr>
         <w:t xml:space="preserve"> сущност</w:t>
       </w:r>
@@ -1982,7 +1827,6 @@
           <w:iCs/>
           <w:sz w:val="26"/>
           <w:szCs w:val="26"/>
-          <w:highlight w:val="yellow"/>
         </w:rPr>
         <w:t>и</w:t>
       </w:r>
@@ -2000,7 +1844,6 @@
           <w:rFonts w:ascii="Times New Roman" w:hAnsi="Times New Roman" w:cs="Times New Roman"/>
           <w:sz w:val="26"/>
           <w:szCs w:val="26"/>
-          <w:highlight w:val="yellow"/>
         </w:rPr>
       </w:pPr>
       <w:r>
@@ -2010,7 +1853,6 @@
           <w:bCs/>
           <w:sz w:val="26"/>
           <w:szCs w:val="26"/>
-          <w:highlight w:val="yellow"/>
         </w:rPr>
         <w:t>Мысль</w:t>
       </w:r>
@@ -2021,7 +1863,6 @@
           <w:bCs/>
           <w:sz w:val="26"/>
           <w:szCs w:val="26"/>
-          <w:highlight w:val="yellow"/>
         </w:rPr>
         <w:t>:</w:t>
       </w:r>
@@ -2030,7 +1871,6 @@
           <w:rFonts w:ascii="Times New Roman" w:hAnsi="Times New Roman" w:cs="Times New Roman"/>
           <w:sz w:val="26"/>
           <w:szCs w:val="26"/>
-          <w:highlight w:val="yellow"/>
         </w:rPr>
         <w:t xml:space="preserve"> </w:t>
       </w:r>
@@ -2039,7 +1879,6 @@
           <w:rFonts w:ascii="Times New Roman" w:hAnsi="Times New Roman" w:cs="Times New Roman"/>
           <w:sz w:val="26"/>
           <w:szCs w:val="26"/>
-          <w:highlight w:val="yellow"/>
         </w:rPr>
         <w:t>персонаж_</w:t>
       </w:r>
@@ -2048,7 +1887,6 @@
           <w:rFonts w:ascii="Times New Roman" w:hAnsi="Times New Roman" w:cs="Times New Roman"/>
           <w:sz w:val="26"/>
           <w:szCs w:val="26"/>
-          <w:highlight w:val="yellow"/>
           <w:lang w:val="en-US"/>
         </w:rPr>
         <w:t>id</w:t>
@@ -2058,7 +1896,6 @@
           <w:rFonts w:ascii="Times New Roman" w:hAnsi="Times New Roman" w:cs="Times New Roman"/>
           <w:sz w:val="26"/>
           <w:szCs w:val="26"/>
-          <w:highlight w:val="yellow"/>
         </w:rPr>
         <w:t xml:space="preserve">, </w:t>
       </w:r>
@@ -2067,7 +1904,6 @@
           <w:rFonts w:ascii="Times New Roman" w:hAnsi="Times New Roman" w:cs="Times New Roman"/>
           <w:sz w:val="26"/>
           <w:szCs w:val="26"/>
-          <w:highlight w:val="yellow"/>
         </w:rPr>
         <w:t>описание</w:t>
       </w:r>
@@ -2076,7 +1912,6 @@
           <w:rFonts w:ascii="Times New Roman" w:hAnsi="Times New Roman" w:cs="Times New Roman"/>
           <w:sz w:val="26"/>
           <w:szCs w:val="26"/>
-          <w:highlight w:val="yellow"/>
         </w:rPr>
         <w:t>, событие</w:t>
       </w:r>
@@ -2085,7 +1920,6 @@
           <w:rFonts w:ascii="Times New Roman" w:hAnsi="Times New Roman" w:cs="Times New Roman"/>
           <w:sz w:val="26"/>
           <w:szCs w:val="26"/>
-          <w:highlight w:val="yellow"/>
         </w:rPr>
         <w:t>_</w:t>
       </w:r>
@@ -2094,7 +1928,6 @@
           <w:rFonts w:ascii="Times New Roman" w:hAnsi="Times New Roman" w:cs="Times New Roman"/>
           <w:sz w:val="26"/>
           <w:szCs w:val="26"/>
-          <w:highlight w:val="yellow"/>
           <w:lang w:val="en-US"/>
         </w:rPr>
         <w:t>id</w:t>
@@ -2104,7 +1937,6 @@
           <w:rFonts w:ascii="Times New Roman" w:hAnsi="Times New Roman" w:cs="Times New Roman"/>
           <w:sz w:val="26"/>
           <w:szCs w:val="26"/>
-          <w:highlight w:val="yellow"/>
         </w:rPr>
         <w:t>(</w:t>
       </w:r>
@@ -2113,7 +1945,6 @@
           <w:rFonts w:ascii="Times New Roman" w:hAnsi="Times New Roman" w:cs="Times New Roman"/>
           <w:sz w:val="26"/>
           <w:szCs w:val="26"/>
-          <w:highlight w:val="yellow"/>
           <w:lang w:val="en-US"/>
         </w:rPr>
         <w:t>nullable</w:t>
@@ -2123,7 +1954,6 @@
           <w:rFonts w:ascii="Times New Roman" w:hAnsi="Times New Roman" w:cs="Times New Roman"/>
           <w:sz w:val="26"/>
           <w:szCs w:val="26"/>
-          <w:highlight w:val="yellow"/>
         </w:rPr>
         <w:t>)</w:t>
       </w:r>
@@ -2141,7 +1971,6 @@
           <w:rFonts w:ascii="Times New Roman" w:hAnsi="Times New Roman" w:cs="Times New Roman"/>
           <w:sz w:val="26"/>
           <w:szCs w:val="26"/>
-          <w:highlight w:val="yellow"/>
         </w:rPr>
       </w:pPr>
       <w:r>
@@ -2151,7 +1980,6 @@
           <w:bCs/>
           <w:sz w:val="26"/>
           <w:szCs w:val="26"/>
-          <w:highlight w:val="yellow"/>
         </w:rPr>
         <w:t>Объект</w:t>
       </w:r>
@@ -2162,7 +1990,6 @@
           <w:bCs/>
           <w:sz w:val="26"/>
           <w:szCs w:val="26"/>
-          <w:highlight w:val="yellow"/>
         </w:rPr>
         <w:t>(</w:t>
       </w:r>
@@ -2173,7 +2000,6 @@
           <w:bCs/>
           <w:sz w:val="26"/>
           <w:szCs w:val="26"/>
-          <w:highlight w:val="yellow"/>
         </w:rPr>
         <w:t>среды</w:t>
       </w:r>
@@ -2184,7 +2010,6 @@
           <w:bCs/>
           <w:sz w:val="26"/>
           <w:szCs w:val="26"/>
-          <w:highlight w:val="yellow"/>
         </w:rPr>
         <w:t>)</w:t>
       </w:r>
@@ -2195,7 +2020,6 @@
           <w:bCs/>
           <w:sz w:val="26"/>
           <w:szCs w:val="26"/>
-          <w:highlight w:val="yellow"/>
         </w:rPr>
         <w:t>:</w:t>
       </w:r>
@@ -2204,7 +2028,6 @@
           <w:rFonts w:ascii="Times New Roman" w:hAnsi="Times New Roman" w:cs="Times New Roman"/>
           <w:sz w:val="26"/>
           <w:szCs w:val="26"/>
-          <w:highlight w:val="yellow"/>
         </w:rPr>
         <w:t xml:space="preserve"> тип, </w:t>
       </w:r>
@@ -2213,7 +2036,6 @@
           <w:rFonts w:ascii="Times New Roman" w:hAnsi="Times New Roman" w:cs="Times New Roman"/>
           <w:sz w:val="26"/>
           <w:szCs w:val="26"/>
-          <w:highlight w:val="yellow"/>
         </w:rPr>
         <w:t>название</w:t>
       </w:r>
@@ -2227,7 +2049,6 @@
           <w:iCs/>
           <w:sz w:val="26"/>
           <w:szCs w:val="26"/>
-          <w:highlight w:val="yellow"/>
         </w:rPr>
       </w:pPr>
       <w:r>
@@ -2237,7 +2058,6 @@
           <w:iCs/>
           <w:sz w:val="26"/>
           <w:szCs w:val="26"/>
-          <w:highlight w:val="yellow"/>
         </w:rPr>
         <w:t>Ассоциативные</w:t>
       </w:r>
@@ -2248,7 +2068,6 @@
           <w:iCs/>
           <w:sz w:val="26"/>
           <w:szCs w:val="26"/>
-          <w:highlight w:val="yellow"/>
         </w:rPr>
         <w:t xml:space="preserve"> - связ</w:t>
       </w:r>
@@ -2259,7 +2078,6 @@
           <w:iCs/>
           <w:sz w:val="26"/>
           <w:szCs w:val="26"/>
-          <w:highlight w:val="yellow"/>
         </w:rPr>
         <w:t>и</w:t>
       </w:r>
@@ -2270,7 +2088,6 @@
           <w:iCs/>
           <w:sz w:val="26"/>
           <w:szCs w:val="26"/>
-          <w:highlight w:val="yellow"/>
         </w:rPr>
         <w:t xml:space="preserve"> между двумя и более сущностями, котор</w:t>
       </w:r>
@@ -2281,7 +2098,6 @@
           <w:iCs/>
           <w:sz w:val="26"/>
           <w:szCs w:val="26"/>
-          <w:highlight w:val="yellow"/>
         </w:rPr>
         <w:t>ые</w:t>
       </w:r>
@@ -2292,7 +2108,6 @@
           <w:iCs/>
           <w:sz w:val="26"/>
           <w:szCs w:val="26"/>
-          <w:highlight w:val="yellow"/>
         </w:rPr>
         <w:t xml:space="preserve"> сам</w:t>
       </w:r>
@@ -2303,7 +2118,6 @@
           <w:iCs/>
           <w:sz w:val="26"/>
           <w:szCs w:val="26"/>
-          <w:highlight w:val="yellow"/>
         </w:rPr>
         <w:t>и</w:t>
       </w:r>
@@ -2314,7 +2128,6 @@
           <w:iCs/>
           <w:sz w:val="26"/>
           <w:szCs w:val="26"/>
-          <w:highlight w:val="yellow"/>
         </w:rPr>
         <w:t xml:space="preserve"> </w:t>
       </w:r>
@@ -2325,7 +2138,6 @@
           <w:iCs/>
           <w:sz w:val="26"/>
           <w:szCs w:val="26"/>
-          <w:highlight w:val="yellow"/>
         </w:rPr>
         <w:t>имеют</w:t>
       </w:r>
@@ -2336,7 +2148,6 @@
           <w:iCs/>
           <w:sz w:val="26"/>
           <w:szCs w:val="26"/>
-          <w:highlight w:val="yellow"/>
         </w:rPr>
         <w:t xml:space="preserve"> атрибуты</w:t>
       </w:r>
@@ -2354,7 +2165,6 @@
           <w:rFonts w:ascii="Times New Roman" w:hAnsi="Times New Roman" w:cs="Times New Roman"/>
           <w:sz w:val="26"/>
           <w:szCs w:val="26"/>
-          <w:highlight w:val="yellow"/>
         </w:rPr>
       </w:pPr>
       <w:r>
@@ -2364,7 +2174,6 @@
           <w:bCs/>
           <w:sz w:val="26"/>
           <w:szCs w:val="26"/>
-          <w:highlight w:val="yellow"/>
         </w:rPr>
         <w:t xml:space="preserve">Участие: </w:t>
       </w:r>
@@ -2373,7 +2182,6 @@
           <w:rFonts w:ascii="Times New Roman" w:hAnsi="Times New Roman" w:cs="Times New Roman"/>
           <w:sz w:val="26"/>
           <w:szCs w:val="26"/>
-          <w:highlight w:val="yellow"/>
         </w:rPr>
         <w:t>персонаж</w:t>
       </w:r>
@@ -2382,7 +2190,6 @@
           <w:rFonts w:ascii="Times New Roman" w:hAnsi="Times New Roman" w:cs="Times New Roman"/>
           <w:sz w:val="26"/>
           <w:szCs w:val="26"/>
-          <w:highlight w:val="yellow"/>
         </w:rPr>
         <w:t>_</w:t>
       </w:r>
@@ -2391,7 +2198,6 @@
           <w:rFonts w:ascii="Times New Roman" w:hAnsi="Times New Roman" w:cs="Times New Roman"/>
           <w:sz w:val="26"/>
           <w:szCs w:val="26"/>
-          <w:highlight w:val="yellow"/>
           <w:lang w:val="en-US"/>
         </w:rPr>
         <w:t>id</w:t>
@@ -2401,7 +2207,6 @@
           <w:rFonts w:ascii="Times New Roman" w:hAnsi="Times New Roman" w:cs="Times New Roman"/>
           <w:sz w:val="26"/>
           <w:szCs w:val="26"/>
-          <w:highlight w:val="yellow"/>
         </w:rPr>
         <w:t>, событие</w:t>
       </w:r>
@@ -2410,7 +2215,6 @@
           <w:rFonts w:ascii="Times New Roman" w:hAnsi="Times New Roman" w:cs="Times New Roman"/>
           <w:sz w:val="26"/>
           <w:szCs w:val="26"/>
-          <w:highlight w:val="yellow"/>
         </w:rPr>
         <w:t>_</w:t>
       </w:r>
@@ -2419,7 +2223,6 @@
           <w:rFonts w:ascii="Times New Roman" w:hAnsi="Times New Roman" w:cs="Times New Roman"/>
           <w:sz w:val="26"/>
           <w:szCs w:val="26"/>
-          <w:highlight w:val="yellow"/>
           <w:lang w:val="en-US"/>
         </w:rPr>
         <w:t>id</w:t>
@@ -2429,7 +2232,6 @@
           <w:rFonts w:ascii="Times New Roman" w:hAnsi="Times New Roman" w:cs="Times New Roman"/>
           <w:sz w:val="26"/>
           <w:szCs w:val="26"/>
-          <w:highlight w:val="yellow"/>
         </w:rPr>
         <w:t>, роль</w:t>
       </w:r>
@@ -2447,7 +2249,6 @@
           <w:rFonts w:ascii="Times New Roman" w:hAnsi="Times New Roman" w:cs="Times New Roman"/>
           <w:sz w:val="26"/>
           <w:szCs w:val="26"/>
-          <w:highlight w:val="yellow"/>
         </w:rPr>
       </w:pPr>
       <w:r>
@@ -2457,7 +2258,6 @@
           <w:bCs/>
           <w:sz w:val="26"/>
           <w:szCs w:val="26"/>
-          <w:highlight w:val="yellow"/>
         </w:rPr>
         <w:t>Эмоция:</w:t>
       </w:r>
@@ -2466,7 +2266,6 @@
           <w:rFonts w:ascii="Times New Roman" w:hAnsi="Times New Roman" w:cs="Times New Roman"/>
           <w:sz w:val="26"/>
           <w:szCs w:val="26"/>
-          <w:highlight w:val="yellow"/>
         </w:rPr>
         <w:t xml:space="preserve"> персонаж_</w:t>
       </w:r>
@@ -2475,7 +2274,6 @@
           <w:rFonts w:ascii="Times New Roman" w:hAnsi="Times New Roman" w:cs="Times New Roman"/>
           <w:sz w:val="26"/>
           <w:szCs w:val="26"/>
-          <w:highlight w:val="yellow"/>
           <w:lang w:val="en-US"/>
         </w:rPr>
         <w:t>id</w:t>
@@ -2485,7 +2283,6 @@
           <w:rFonts w:ascii="Times New Roman" w:hAnsi="Times New Roman" w:cs="Times New Roman"/>
           <w:sz w:val="26"/>
           <w:szCs w:val="26"/>
-          <w:highlight w:val="yellow"/>
         </w:rPr>
         <w:t>, тип, интенсивность, событие_</w:t>
       </w:r>
@@ -2494,7 +2291,6 @@
           <w:rFonts w:ascii="Times New Roman" w:hAnsi="Times New Roman" w:cs="Times New Roman"/>
           <w:sz w:val="26"/>
           <w:szCs w:val="26"/>
-          <w:highlight w:val="yellow"/>
           <w:lang w:val="en-US"/>
         </w:rPr>
         <w:t>id</w:t>
@@ -2504,7 +2300,6 @@
           <w:rFonts w:ascii="Times New Roman" w:hAnsi="Times New Roman" w:cs="Times New Roman"/>
           <w:sz w:val="26"/>
           <w:szCs w:val="26"/>
-          <w:highlight w:val="yellow"/>
         </w:rPr>
         <w:t>(причина)</w:t>
       </w:r>
@@ -2533,7 +2328,6 @@
           <w:bCs/>
           <w:sz w:val="26"/>
           <w:szCs w:val="26"/>
-          <w:highlight w:val="yellow"/>
         </w:rPr>
         <w:t>Обстоятельства:</w:t>
       </w:r>
@@ -2542,7 +2336,6 @@
           <w:rFonts w:ascii="Times New Roman" w:hAnsi="Times New Roman" w:cs="Times New Roman"/>
           <w:sz w:val="26"/>
           <w:szCs w:val="26"/>
-          <w:highlight w:val="yellow"/>
         </w:rPr>
         <w:t xml:space="preserve"> место_</w:t>
       </w:r>
@@ -2551,7 +2344,6 @@
           <w:rFonts w:ascii="Times New Roman" w:hAnsi="Times New Roman" w:cs="Times New Roman"/>
           <w:sz w:val="26"/>
           <w:szCs w:val="26"/>
-          <w:highlight w:val="yellow"/>
           <w:lang w:val="en-US"/>
         </w:rPr>
         <w:t>id</w:t>
@@ -2561,7 +2353,6 @@
           <w:rFonts w:ascii="Times New Roman" w:hAnsi="Times New Roman" w:cs="Times New Roman"/>
           <w:sz w:val="26"/>
           <w:szCs w:val="26"/>
-          <w:highlight w:val="yellow"/>
         </w:rPr>
         <w:t>, событие_</w:t>
       </w:r>
@@ -2570,7 +2361,6 @@
           <w:rFonts w:ascii="Times New Roman" w:hAnsi="Times New Roman" w:cs="Times New Roman"/>
           <w:sz w:val="26"/>
           <w:szCs w:val="26"/>
-          <w:highlight w:val="yellow"/>
           <w:lang w:val="en-US"/>
         </w:rPr>
         <w:t>id</w:t>
@@ -2580,7 +2370,6 @@
           <w:rFonts w:ascii="Times New Roman" w:hAnsi="Times New Roman" w:cs="Times New Roman"/>
           <w:sz w:val="26"/>
           <w:szCs w:val="26"/>
-          <w:highlight w:val="yellow"/>
         </w:rPr>
         <w:t>, время</w:t>
       </w:r>
@@ -2611,10 +2400,10 @@
           <w:noProof/>
         </w:rPr>
         <w:drawing>
-          <wp:inline distT="0" distB="0" distL="0" distR="0" wp14:anchorId="1B84D352" wp14:editId="4CB36B48">
-            <wp:extent cx="5934710" cy="7557135"/>
-            <wp:effectExtent l="0" t="0" r="8890" b="5715"/>
-            <wp:docPr id="895196053" name="Рисунок 1"/>
+          <wp:inline distT="0" distB="0" distL="0" distR="0" wp14:anchorId="140E72B0" wp14:editId="5874CAF5">
+            <wp:extent cx="5934710" cy="7552690"/>
+            <wp:effectExtent l="0" t="0" r="8890" b="0"/>
+            <wp:docPr id="701959469" name="Рисунок 7"/>
             <wp:cNvGraphicFramePr>
               <a:graphicFrameLocks xmlns:a="http://schemas.openxmlformats.org/drawingml/2006/main" noChangeAspect="1"/>
             </wp:cNvGraphicFramePr>
@@ -2622,7 +2411,7 @@
               <a:graphicData uri="http://schemas.openxmlformats.org/drawingml/2006/picture">
                 <pic:pic xmlns:pic="http://schemas.openxmlformats.org/drawingml/2006/picture">
                   <pic:nvPicPr>
-                    <pic:cNvPr id="0" name="Picture 1"/>
+                    <pic:cNvPr id="0" name="Picture 49"/>
                     <pic:cNvPicPr>
                       <a:picLocks noChangeAspect="1" noChangeArrowheads="1"/>
                     </pic:cNvPicPr>
@@ -2643,7 +2432,7 @@
                   <pic:spPr bwMode="auto">
                     <a:xfrm>
                       <a:off x="0" y="0"/>
-                      <a:ext cx="5934710" cy="7557135"/>
+                      <a:ext cx="5934710" cy="7552690"/>
                     </a:xfrm>
                     <a:prstGeom prst="rect">
                       <a:avLst/>
@@ -2690,28 +2479,53 @@
       </w:r>
     </w:p>
     <w:p>
-      <w:pPr>
-        <w:rPr>
-          <w:lang w:val="en-US"/>
-        </w:rPr>
-      </w:pPr>
-      <w:r>
-        <w:rPr>
-          <w:lang w:val="en-US"/>
-        </w:rPr>
-        <w:t>Persons:</w:t>
-      </w:r>
-      <w:r>
-        <w:rPr>
-          <w:lang w:val="en-US"/>
-        </w:rPr>
+      <w:r>
+        <w:rPr>
+          <w:lang w:val="en-US"/>
+        </w:rPr>
+        <w:t>Persons</w:t>
+      </w:r>
+      <w:r>
+        <w:t>:</w:t>
+      </w:r>
+      <w:r>
         <w:tab/>
       </w:r>
       <w:r>
-        <w:rPr>
-          <w:lang w:val="en-US"/>
-        </w:rPr>
-        <w:t>id → name, sex, birthdate</w:t>
+        <w:tab/>
+      </w:r>
+      <w:r>
+        <w:rPr>
+          <w:lang w:val="en-US"/>
+        </w:rPr>
+        <w:t>id</w:t>
+      </w:r>
+      <w:r>
+        <w:t xml:space="preserve"> → </w:t>
+      </w:r>
+      <w:r>
+        <w:rPr>
+          <w:lang w:val="en-US"/>
+        </w:rPr>
+        <w:t>name</w:t>
+      </w:r>
+      <w:r>
+        <w:t xml:space="preserve">, </w:t>
+      </w:r>
+      <w:r>
+        <w:rPr>
+          <w:lang w:val="en-US"/>
+        </w:rPr>
+        <w:t>sex</w:t>
+      </w:r>
+      <w:r>
+        <w:t xml:space="preserve">, </w:t>
+      </w:r>
+      <w:r>
+        <w:rPr>
+          <w:lang w:val="en-US"/>
+        </w:rPr>
+        <w:t>birthdate</w:t>
       </w:r>
     </w:p>
     <w:p>
@@ -2742,21 +2556,13 @@
         <w:rPr>
           <w:lang w:val="en-US"/>
         </w:rPr>
-        <w:t xml:space="preserve">id → </w:t>
-      </w:r>
-      <w:proofErr w:type="spellStart"/>
-      <w:r>
-        <w:rPr>
-          <w:lang w:val="en-US"/>
-        </w:rPr>
-        <w:t>event_type</w:t>
-      </w:r>
-      <w:proofErr w:type="spellEnd"/>
-      <w:r>
-        <w:rPr>
-          <w:lang w:val="en-US"/>
-        </w:rPr>
-        <w:t>, description</w:t>
+        <w:tab/>
+      </w:r>
+      <w:r>
+        <w:rPr>
+          <w:lang w:val="en-US"/>
+        </w:rPr>
+        <w:t>id → event_type, description</w:t>
       </w:r>
     </w:p>
     <w:p>
@@ -2782,323 +2588,375 @@
           <w:lang w:val="en-US"/>
         </w:rPr>
         <w:tab/>
+      </w:r>
+      <w:r>
+        <w:rPr>
+          <w:lang w:val="en-US"/>
+        </w:rPr>
+        <w:tab/>
+      </w:r>
+      <w:r>
+        <w:rPr>
+          <w:lang w:val="en-US"/>
+        </w:rPr>
         <w:t>i</w:t>
       </w:r>
       <w:r>
         <w:rPr>
           <w:lang w:val="en-US"/>
         </w:rPr>
-        <w:t xml:space="preserve">d → name, </w:t>
-      </w:r>
-      <w:proofErr w:type="spellStart"/>
-      <w:r>
-        <w:rPr>
-          <w:lang w:val="en-US"/>
-        </w:rPr>
-        <w:t>coord_x</w:t>
-      </w:r>
-      <w:proofErr w:type="spellEnd"/>
-      <w:r>
-        <w:rPr>
-          <w:lang w:val="en-US"/>
-        </w:rPr>
+        <w:t>d → name, coord_x, coord_y, description</w:t>
+      </w:r>
+    </w:p>
+    <w:p>
+      <w:pPr>
+        <w:rPr>
+          <w:lang w:val="en-US"/>
+        </w:rPr>
+      </w:pPr>
+      <w:r>
+        <w:rPr>
+          <w:lang w:val="en-US"/>
+        </w:rPr>
+        <w:t>Thoughts:</w:t>
+      </w:r>
+      <w:r>
+        <w:rPr>
+          <w:lang w:val="en-US"/>
+        </w:rPr>
+        <w:tab/>
+      </w:r>
+      <w:r>
+        <w:rPr>
+          <w:lang w:val="en-US"/>
+        </w:rPr>
+        <w:tab/>
+      </w:r>
+      <w:r>
+        <w:rPr>
+          <w:lang w:val="en-US"/>
+        </w:rPr>
+        <w:t>id → person_id, event_id, text</w:t>
+      </w:r>
+    </w:p>
+    <w:p>
+      <w:pPr>
+        <w:rPr>
+          <w:lang w:val="en-US"/>
+        </w:rPr>
+      </w:pPr>
+      <w:r>
+        <w:rPr>
+          <w:lang w:val="en-US"/>
+        </w:rPr>
+        <w:t xml:space="preserve">Objects: </w:t>
+      </w:r>
+      <w:r>
+        <w:rPr>
+          <w:lang w:val="en-US"/>
+        </w:rPr>
+        <w:tab/>
+      </w:r>
+      <w:r>
+        <w:rPr>
+          <w:lang w:val="en-US"/>
+        </w:rPr>
+        <w:tab/>
+      </w:r>
+      <w:r>
+        <w:rPr>
+          <w:lang w:val="en-US"/>
+        </w:rPr>
+        <w:t>id → obj_type, name, place_id</w:t>
+      </w:r>
+    </w:p>
+    <w:p>
+      <w:pPr>
+        <w:rPr>
+          <w:lang w:val="en-US"/>
+        </w:rPr>
+      </w:pPr>
+      <w:r>
+        <w:rPr>
+          <w:lang w:val="en-US"/>
+        </w:rPr>
+        <w:t>Emotions:</w:t>
+      </w:r>
+      <w:r>
+        <w:rPr>
+          <w:lang w:val="en-US"/>
+        </w:rPr>
+        <w:tab/>
+      </w:r>
+      <w:r>
+        <w:rPr>
+          <w:lang w:val="en-US"/>
+        </w:rPr>
+        <w:tab/>
+      </w:r>
+      <w:r>
+        <w:rPr>
+          <w:lang w:val="en-US"/>
+        </w:rPr>
+        <w:t>id → person_id, event_id, emotion_type, intensity</w:t>
+      </w:r>
+    </w:p>
+    <w:p>
+      <w:pPr>
+        <w:rPr>
+          <w:lang w:val="en-US"/>
+        </w:rPr>
+      </w:pPr>
+      <w:r>
+        <w:rPr>
+          <w:lang w:val="en-US"/>
+        </w:rPr>
+        <w:t>Participations:</w:t>
+      </w:r>
+      <w:r>
+        <w:rPr>
+          <w:lang w:val="en-US"/>
+        </w:rPr>
+        <w:tab/>
+      </w:r>
+      <w:r>
+        <w:rPr>
+          <w:lang w:val="en-US"/>
+        </w:rPr>
+        <w:tab/>
+      </w:r>
+      <w:r>
+        <w:rPr>
+          <w:lang w:val="en-US"/>
+        </w:rPr>
+        <w:t>id → person_id, event_id, participate_role</w:t>
+      </w:r>
+    </w:p>
+    <w:p>
+      <w:pPr>
+        <w:rPr>
+          <w:lang w:val="en-US"/>
+        </w:rPr>
+      </w:pPr>
+      <w:r>
+        <w:rPr>
+          <w:lang w:val="en-US"/>
+        </w:rPr>
+        <w:t>Conditions:</w:t>
+      </w:r>
+      <w:r>
+        <w:rPr>
+          <w:lang w:val="en-US"/>
+        </w:rPr>
+        <w:tab/>
+      </w:r>
+      <w:r>
+        <w:rPr>
+          <w:lang w:val="en-US"/>
+        </w:rPr>
+        <w:tab/>
+      </w:r>
+      <w:r>
+        <w:rPr>
+          <w:lang w:val="en-US"/>
+        </w:rPr>
+        <w:t>id → time, event_id, place_id</w:t>
+      </w:r>
+    </w:p>
+    <w:p>
+      <w:pPr>
+        <w:rPr>
+          <w:lang w:val="en-US"/>
+        </w:rPr>
+      </w:pPr>
+    </w:p>
+    <w:p>
+      <w:pPr>
+        <w:pStyle w:val="a3"/>
+      </w:pPr>
+      <w:r>
+        <w:t>Нормальные формы</w:t>
+      </w:r>
+    </w:p>
+    <w:p>
+      <w:r>
+        <w:t>1</w:t>
+      </w:r>
+      <w:r>
+        <w:rPr>
+          <w:lang w:val="en-US"/>
+        </w:rPr>
+        <w:t>NF</w:t>
+      </w:r>
+      <w:r>
+        <w:t xml:space="preserve">: </w:t>
+      </w:r>
+      <w:r>
+        <w:t xml:space="preserve">Отношение находится в </w:t>
+      </w:r>
+      <w:r>
+        <w:t>1</w:t>
+      </w:r>
+      <w:r>
+        <w:rPr>
+          <w:lang w:val="en-US"/>
+        </w:rPr>
+        <w:t>NF</w:t>
+      </w:r>
+      <w:r>
+        <w:t>, если все его атрибуты содержат только атомарные значения</w:t>
+      </w:r>
+      <w:r>
+        <w:t xml:space="preserve">, нет повторяющихся столбцов, для идентификации существует первичный ключ. </w:t>
+      </w:r>
+      <w:r>
+        <w:t xml:space="preserve"> Моя модель удовлетворяет </w:t>
+      </w:r>
+      <w:r>
+        <w:t>1</w:t>
+      </w:r>
+      <w:r>
+        <w:rPr>
+          <w:lang w:val="en-US"/>
+        </w:rPr>
+        <w:t>NF</w:t>
+      </w:r>
+      <w:r>
         <w:t xml:space="preserve">, </w:t>
       </w:r>
-      <w:proofErr w:type="spellStart"/>
-      <w:r>
-        <w:rPr>
-          <w:lang w:val="en-US"/>
-        </w:rPr>
-        <w:t>coord_y</w:t>
-      </w:r>
-      <w:proofErr w:type="spellEnd"/>
-      <w:r>
-        <w:rPr>
-          <w:lang w:val="en-US"/>
-        </w:rPr>
-        <w:t>, description</w:t>
-      </w:r>
-    </w:p>
-    <w:p>
-      <w:pPr>
-        <w:rPr>
-          <w:lang w:val="en-US"/>
-        </w:rPr>
-      </w:pPr>
-      <w:r>
-        <w:rPr>
-          <w:lang w:val="en-US"/>
-        </w:rPr>
-        <w:t>Thoughts:</w:t>
-      </w:r>
-      <w:r>
-        <w:rPr>
-          <w:lang w:val="en-US"/>
-        </w:rPr>
-        <w:tab/>
-      </w:r>
-      <w:r>
-        <w:rPr>
-          <w:lang w:val="en-US"/>
-        </w:rPr>
-        <w:t xml:space="preserve">id → </w:t>
-      </w:r>
-      <w:proofErr w:type="spellStart"/>
-      <w:r>
-        <w:rPr>
-          <w:lang w:val="en-US"/>
-        </w:rPr>
-        <w:t>person_id</w:t>
-      </w:r>
-      <w:proofErr w:type="spellEnd"/>
-      <w:r>
-        <w:rPr>
-          <w:lang w:val="en-US"/>
-        </w:rPr>
+      <w:r>
+        <w:t>так как выполняет все эти требования.</w:t>
+      </w:r>
+    </w:p>
+    <w:p>
+      <w:r>
+        <w:t>2</w:t>
+      </w:r>
+      <w:r>
+        <w:rPr>
+          <w:lang w:val="en-US"/>
+        </w:rPr>
+        <w:t>NF</w:t>
+      </w:r>
+      <w:r>
+        <w:t xml:space="preserve">: </w:t>
+      </w:r>
+      <w:r>
+        <w:t xml:space="preserve">Отношение находится в </w:t>
+      </w:r>
+      <w:r>
+        <w:t>2</w:t>
+      </w:r>
+      <w:r>
+        <w:rPr>
+          <w:lang w:val="en-US"/>
+        </w:rPr>
+        <w:t>NF</w:t>
+      </w:r>
+      <w:r>
+        <w:t xml:space="preserve">, если </w:t>
+      </w:r>
+      <w:r>
+        <w:t>удовлетворяет 1</w:t>
+      </w:r>
+      <w:r>
+        <w:rPr>
+          <w:lang w:val="en-US"/>
+        </w:rPr>
+        <w:t>NF</w:t>
+      </w:r>
+      <w:r>
+        <w:t xml:space="preserve"> </w:t>
+      </w:r>
+      <w:r>
+        <w:t xml:space="preserve">и </w:t>
+      </w:r>
+      <w:r>
+        <w:t>все неключевые атрибуты полностью зависят от первичного ключа.</w:t>
+      </w:r>
+      <w:r>
+        <w:t xml:space="preserve"> </w:t>
+      </w:r>
+      <w:r>
+        <w:t xml:space="preserve">Моя модель удовлетворяет </w:t>
+      </w:r>
+      <w:r>
+        <w:t>2</w:t>
+      </w:r>
+      <w:r>
+        <w:rPr>
+          <w:lang w:val="en-US"/>
+        </w:rPr>
+        <w:t>NF</w:t>
+      </w:r>
+      <w:r>
         <w:t xml:space="preserve">, </w:t>
       </w:r>
-      <w:proofErr w:type="spellStart"/>
-      <w:r>
-        <w:rPr>
-          <w:lang w:val="en-US"/>
-        </w:rPr>
-        <w:t>event_id</w:t>
-      </w:r>
-      <w:proofErr w:type="spellEnd"/>
-      <w:r>
-        <w:rPr>
-          <w:lang w:val="en-US"/>
-        </w:rPr>
-        <w:t>, text</w:t>
-      </w:r>
-    </w:p>
-    <w:p>
-      <w:pPr>
-        <w:rPr>
-          <w:lang w:val="en-US"/>
-        </w:rPr>
-      </w:pPr>
-      <w:r>
-        <w:rPr>
-          <w:lang w:val="en-US"/>
-        </w:rPr>
-        <w:t xml:space="preserve">Objects: </w:t>
-      </w:r>
-      <w:r>
-        <w:rPr>
-          <w:lang w:val="en-US"/>
-        </w:rPr>
-        <w:tab/>
-      </w:r>
-      <w:r>
-        <w:rPr>
-          <w:lang w:val="en-US"/>
-        </w:rPr>
-        <w:t xml:space="preserve">id → </w:t>
-      </w:r>
-      <w:proofErr w:type="spellStart"/>
-      <w:r>
-        <w:rPr>
-          <w:lang w:val="en-US"/>
-        </w:rPr>
-        <w:t>obj_type</w:t>
-      </w:r>
-      <w:proofErr w:type="spellEnd"/>
-      <w:r>
-        <w:rPr>
-          <w:lang w:val="en-US"/>
-        </w:rPr>
-        <w:t xml:space="preserve">, name, </w:t>
-      </w:r>
-      <w:proofErr w:type="spellStart"/>
-      <w:r>
-        <w:rPr>
-          <w:lang w:val="en-US"/>
-        </w:rPr>
-        <w:t>place_id</w:t>
-      </w:r>
-      <w:proofErr w:type="spellEnd"/>
-    </w:p>
-    <w:p>
-      <w:pPr>
-        <w:rPr>
-          <w:lang w:val="en-US"/>
-        </w:rPr>
-      </w:pPr>
-      <w:r>
-        <w:rPr>
-          <w:lang w:val="en-US"/>
-        </w:rPr>
-        <w:t>Emotions:</w:t>
-      </w:r>
-      <w:r>
-        <w:rPr>
-          <w:lang w:val="en-US"/>
-        </w:rPr>
-        <w:tab/>
-      </w:r>
-      <w:r>
-        <w:rPr>
-          <w:lang w:val="en-US"/>
-        </w:rPr>
-        <w:t xml:space="preserve">id → </w:t>
-      </w:r>
-      <w:proofErr w:type="spellStart"/>
-      <w:r>
-        <w:rPr>
-          <w:lang w:val="en-US"/>
-        </w:rPr>
-        <w:t>person_id</w:t>
-      </w:r>
-      <w:proofErr w:type="spellEnd"/>
-      <w:r>
-        <w:rPr>
-          <w:lang w:val="en-US"/>
-        </w:rPr>
+      <w:r>
+        <w:t>так как выполняет все эти требования.</w:t>
+      </w:r>
+    </w:p>
+    <w:p>
+      <w:r>
+        <w:t>3</w:t>
+      </w:r>
+      <w:r>
+        <w:rPr>
+          <w:lang w:val="en-US"/>
+        </w:rPr>
+        <w:t>NF</w:t>
+      </w:r>
+      <w:r>
+        <w:t xml:space="preserve">: </w:t>
+      </w:r>
+      <w:r>
+        <w:t xml:space="preserve">Отношение находится в </w:t>
+      </w:r>
+      <w:r>
+        <w:t>3</w:t>
+      </w:r>
+      <w:r>
+        <w:rPr>
+          <w:lang w:val="en-US"/>
+        </w:rPr>
+        <w:t>NF</w:t>
+      </w:r>
+      <w:r>
+        <w:t xml:space="preserve">, если </w:t>
+      </w:r>
+      <w:r>
+        <w:t>удовлетворяет 2</w:t>
+      </w:r>
+      <w:r>
+        <w:rPr>
+          <w:lang w:val="en-US"/>
+        </w:rPr>
+        <w:t>NF</w:t>
+      </w:r>
+      <w:r>
+        <w:t xml:space="preserve"> </w:t>
+      </w:r>
+      <w:r>
+        <w:t xml:space="preserve">и нет транзитивных зависимостей. Моя модель удовлетворяет </w:t>
+      </w:r>
+      <w:r>
+        <w:t>3</w:t>
+      </w:r>
+      <w:r>
+        <w:rPr>
+          <w:lang w:val="en-US"/>
+        </w:rPr>
+        <w:t>NF</w:t>
+      </w:r>
+      <w:r>
         <w:t xml:space="preserve">, </w:t>
       </w:r>
-      <w:proofErr w:type="spellStart"/>
-      <w:r>
-        <w:rPr>
-          <w:lang w:val="en-US"/>
-        </w:rPr>
-        <w:t>event_id</w:t>
-      </w:r>
-      <w:proofErr w:type="spellEnd"/>
-      <w:r>
-        <w:rPr>
-          <w:lang w:val="en-US"/>
-        </w:rPr>
-        <w:t xml:space="preserve">, </w:t>
-      </w:r>
-      <w:proofErr w:type="spellStart"/>
-      <w:r>
-        <w:rPr>
-          <w:lang w:val="en-US"/>
-        </w:rPr>
-        <w:t>emotion_type</w:t>
-      </w:r>
-      <w:proofErr w:type="spellEnd"/>
-      <w:r>
-        <w:rPr>
-          <w:lang w:val="en-US"/>
-        </w:rPr>
-        <w:t>, intensity</w:t>
-      </w:r>
-    </w:p>
-    <w:p>
-      <w:pPr>
-        <w:rPr>
-          <w:lang w:val="en-US"/>
-        </w:rPr>
-      </w:pPr>
-      <w:r>
-        <w:rPr>
-          <w:lang w:val="en-US"/>
-        </w:rPr>
-        <w:t>Participations:</w:t>
-      </w:r>
-      <w:r>
-        <w:rPr>
-          <w:lang w:val="en-US"/>
-        </w:rPr>
-        <w:tab/>
-      </w:r>
-      <w:r>
-        <w:rPr>
-          <w:lang w:val="en-US"/>
-        </w:rPr>
-        <w:tab/>
-      </w:r>
-      <w:r>
-        <w:rPr>
-          <w:lang w:val="en-US"/>
-        </w:rPr>
-        <w:t xml:space="preserve">id → </w:t>
-      </w:r>
-      <w:proofErr w:type="spellStart"/>
-      <w:r>
-        <w:rPr>
-          <w:lang w:val="en-US"/>
-        </w:rPr>
-        <w:t>person_id</w:t>
-      </w:r>
-      <w:proofErr w:type="spellEnd"/>
-      <w:r>
-        <w:rPr>
-          <w:lang w:val="en-US"/>
-        </w:rPr>
-        <w:t xml:space="preserve">, </w:t>
-      </w:r>
-      <w:proofErr w:type="spellStart"/>
-      <w:r>
-        <w:rPr>
-          <w:lang w:val="en-US"/>
-        </w:rPr>
-        <w:t>event_id</w:t>
-      </w:r>
-      <w:proofErr w:type="spellEnd"/>
-      <w:r>
-        <w:rPr>
-          <w:lang w:val="en-US"/>
-        </w:rPr>
-        <w:t xml:space="preserve">, </w:t>
-      </w:r>
-      <w:proofErr w:type="spellStart"/>
-      <w:r>
-        <w:rPr>
-          <w:lang w:val="en-US"/>
-        </w:rPr>
-        <w:t>participate_role</w:t>
-      </w:r>
-      <w:proofErr w:type="spellEnd"/>
-    </w:p>
-    <w:p>
-      <w:pPr>
-        <w:rPr>
-          <w:lang w:val="en-US"/>
-        </w:rPr>
-      </w:pPr>
-      <w:r>
-        <w:rPr>
-          <w:lang w:val="en-US"/>
-        </w:rPr>
-        <w:t>Conditions:</w:t>
-      </w:r>
-      <w:r>
-        <w:rPr>
-          <w:lang w:val="en-US"/>
-        </w:rPr>
-        <w:tab/>
-      </w:r>
-      <w:r>
-        <w:rPr>
-          <w:lang w:val="en-US"/>
-        </w:rPr>
-        <w:t xml:space="preserve">id → time, </w:t>
-      </w:r>
-      <w:proofErr w:type="spellStart"/>
-      <w:r>
-        <w:rPr>
-          <w:lang w:val="en-US"/>
-        </w:rPr>
-        <w:t>event_id</w:t>
-      </w:r>
-      <w:proofErr w:type="spellEnd"/>
-      <w:r>
-        <w:rPr>
-          <w:lang w:val="en-US"/>
-        </w:rPr>
-        <w:t xml:space="preserve">, </w:t>
-      </w:r>
-      <w:proofErr w:type="spellStart"/>
-      <w:r>
-        <w:rPr>
-          <w:lang w:val="en-US"/>
-        </w:rPr>
-        <w:t>place_id</w:t>
-      </w:r>
-      <w:proofErr w:type="spellEnd"/>
+      <w:r>
+        <w:t>так как выполняет все эти требования.</w:t>
+      </w:r>
+      <w:r>
+        <w:t xml:space="preserve"> </w:t>
+      </w:r>
     </w:p>
     <w:p/>
     <w:p>
@@ -3106,280 +2964,172 @@
         <w:pStyle w:val="a3"/>
       </w:pPr>
       <w:r>
-        <w:t>Нормальные формы</w:t>
-      </w:r>
-    </w:p>
-    <w:p>
-      <w:r>
-        <w:t>1</w:t>
-      </w:r>
-      <w:r>
-        <w:rPr>
-          <w:lang w:val="en-US"/>
-        </w:rPr>
-        <w:t>NF</w:t>
-      </w:r>
-      <w:r>
-        <w:t xml:space="preserve">: </w:t>
-      </w:r>
-      <w:r>
-        <w:t xml:space="preserve">Отношение находится в </w:t>
-      </w:r>
-      <w:r>
-        <w:t>1</w:t>
-      </w:r>
-      <w:r>
-        <w:rPr>
-          <w:lang w:val="en-US"/>
-        </w:rPr>
-        <w:t>NF</w:t>
-      </w:r>
-      <w:r>
-        <w:t>, если все его атрибуты содержат только атомарные значения</w:t>
-      </w:r>
-      <w:r>
-        <w:t xml:space="preserve">, нет повторяющихся столбцов, для идентификации существует первичный ключ. </w:t>
-      </w:r>
-      <w:r>
-        <w:t xml:space="preserve"> Моя модель удовлетворяет </w:t>
-      </w:r>
-      <w:r>
-        <w:t>1</w:t>
-      </w:r>
-      <w:r>
-        <w:rPr>
-          <w:lang w:val="en-US"/>
-        </w:rPr>
-        <w:t>NF</w:t>
-      </w:r>
-      <w:r>
-        <w:t xml:space="preserve">, </w:t>
-      </w:r>
-      <w:r>
-        <w:t>так как выполняет все эти требования.</w:t>
-      </w:r>
-    </w:p>
-    <w:p>
-      <w:r>
-        <w:t>2</w:t>
-      </w:r>
-      <w:r>
-        <w:rPr>
-          <w:lang w:val="en-US"/>
-        </w:rPr>
-        <w:t>NF</w:t>
-      </w:r>
-      <w:r>
-        <w:t xml:space="preserve">: </w:t>
-      </w:r>
-      <w:r>
-        <w:t xml:space="preserve">Отношение находится в </w:t>
-      </w:r>
-      <w:r>
-        <w:t>2</w:t>
-      </w:r>
-      <w:r>
-        <w:rPr>
-          <w:lang w:val="en-US"/>
-        </w:rPr>
-        <w:t>NF</w:t>
-      </w:r>
-      <w:r>
-        <w:t xml:space="preserve">, если </w:t>
-      </w:r>
-      <w:r>
-        <w:t>удовлетворяет 1</w:t>
-      </w:r>
-      <w:r>
-        <w:rPr>
-          <w:lang w:val="en-US"/>
-        </w:rPr>
-        <w:t>NF</w:t>
+        <w:rPr>
+          <w:lang w:val="en-US"/>
+        </w:rPr>
+        <w:t>BCNF</w:t>
+      </w:r>
+    </w:p>
+    <w:p>
+      <w:r>
+        <w:t xml:space="preserve">Таблица находится в BCNF, если для каждой ее нетривиальной функциональной зависимости </w:t>
+      </w:r>
+      <w:r>
+        <w:rPr>
+          <w:lang w:val="en-US"/>
+        </w:rPr>
+        <w:t>X</w:t>
+      </w:r>
+      <w:r>
+        <w:t xml:space="preserve"> -&gt; </w:t>
+      </w:r>
+      <w:r>
+        <w:rPr>
+          <w:lang w:val="en-US"/>
+        </w:rPr>
+        <w:t>Y</w:t>
       </w:r>
       <w:r>
         <w:t xml:space="preserve"> </w:t>
       </w:r>
       <w:r>
+        <w:t>левая часть</w:t>
+      </w:r>
+      <w:r>
+        <w:t>(</w:t>
+      </w:r>
+      <w:r>
+        <w:rPr>
+          <w:lang w:val="en-US"/>
+        </w:rPr>
+        <w:t>X</w:t>
+      </w:r>
+      <w:r>
+        <w:t>)</w:t>
+      </w:r>
+      <w:r>
+        <w:t xml:space="preserve"> является суперключом.</w:t>
+      </w:r>
+    </w:p>
+    <w:p/>
+    <w:p>
+      <w:pPr>
+        <w:pStyle w:val="a3"/>
+      </w:pPr>
+      <w:r>
+        <w:t>Денормализация</w:t>
+      </w:r>
+    </w:p>
+    <w:p>
+      <w:r>
+        <w:t>Возможно,</w:t>
+      </w:r>
+      <w:r>
+        <w:t xml:space="preserve"> для ускорения проведения запросов стоит объединить таблицы </w:t>
+      </w:r>
+      <w:r>
+        <w:rPr>
+          <w:lang w:val="en-US"/>
+        </w:rPr>
+        <w:t>Participations</w:t>
+      </w:r>
+      <w:r>
+        <w:t xml:space="preserve"> </w:t>
+      </w:r>
+      <w:r>
         <w:t xml:space="preserve">и </w:t>
       </w:r>
       <w:r>
-        <w:t>все неключевые атрибуты полностью зависят от первичного ключа.</w:t>
+        <w:rPr>
+          <w:lang w:val="en-US"/>
+        </w:rPr>
+        <w:t>Emotion</w:t>
+      </w:r>
+      <w:r>
+        <w:t>, если часто будут проводиться запрашиваться данные о участии человека в событии и</w:t>
+      </w:r>
+      <w:r>
+        <w:t xml:space="preserve"> его эмоции</w:t>
+      </w:r>
+      <w:r>
+        <w:t>.</w:t>
+      </w:r>
+    </w:p>
+    <w:p/>
+    <w:p>
+      <w:pPr>
+        <w:pStyle w:val="a3"/>
+      </w:pPr>
+      <w:r>
+        <w:lastRenderedPageBreak/>
+        <w:t>Функция</w:t>
       </w:r>
       <w:r>
         <w:t xml:space="preserve"> </w:t>
       </w:r>
       <w:r>
-        <w:t xml:space="preserve">Моя модель удовлетворяет </w:t>
-      </w:r>
-      <w:r>
-        <w:t>2</w:t>
-      </w:r>
-      <w:r>
-        <w:rPr>
-          <w:lang w:val="en-US"/>
-        </w:rPr>
-        <w:t>NF</w:t>
-      </w:r>
-      <w:r>
-        <w:t xml:space="preserve">, </w:t>
-      </w:r>
-      <w:r>
-        <w:t>так как выполняет все эти требования.</w:t>
-      </w:r>
-    </w:p>
-    <w:p>
-      <w:pPr>
-        <w:rPr>
-          <w:lang w:val="en-US"/>
-        </w:rPr>
-      </w:pPr>
-      <w:r>
-        <w:t>3</w:t>
-      </w:r>
-      <w:r>
-        <w:rPr>
-          <w:lang w:val="en-US"/>
-        </w:rPr>
-        <w:t>NF</w:t>
-      </w:r>
-      <w:r>
-        <w:t xml:space="preserve">: </w:t>
-      </w:r>
-      <w:r>
-        <w:t xml:space="preserve">Отношение находится в </w:t>
-      </w:r>
-      <w:r>
-        <w:t>3</w:t>
-      </w:r>
-      <w:r>
-        <w:rPr>
-          <w:lang w:val="en-US"/>
-        </w:rPr>
-        <w:t>NF</w:t>
-      </w:r>
-      <w:r>
-        <w:t xml:space="preserve">, если </w:t>
-      </w:r>
-      <w:r>
-        <w:t xml:space="preserve">удовлетворяет </w:t>
-      </w:r>
-      <w:r>
-        <w:t>2</w:t>
-      </w:r>
-      <w:r>
-        <w:rPr>
-          <w:lang w:val="en-US"/>
-        </w:rPr>
-        <w:t>NF</w:t>
+        <w:t>и</w:t>
       </w:r>
       <w:r>
         <w:t xml:space="preserve"> </w:t>
       </w:r>
       <w:r>
-        <w:t xml:space="preserve">и нет транзитивных зависимостей. </w:t>
-      </w:r>
-      <w:r>
-        <w:t xml:space="preserve">Моя модель удовлетворяет </w:t>
-      </w:r>
-      <w:r>
-        <w:t>3</w:t>
-      </w:r>
-      <w:r>
-        <w:rPr>
-          <w:lang w:val="en-US"/>
-        </w:rPr>
-        <w:t>NF</w:t>
-      </w:r>
-      <w:r>
-        <w:t xml:space="preserve">, </w:t>
-      </w:r>
-      <w:r>
-        <w:t>так как выполняет все эти требования</w:t>
-      </w:r>
-      <w:proofErr w:type="gramStart"/>
-      <w:r>
-        <w:t>.</w:t>
-      </w:r>
-      <w:r>
-        <w:t xml:space="preserve"> ???</w:t>
-      </w:r>
-      <w:proofErr w:type="gramEnd"/>
-    </w:p>
-    <w:p>
-      <w:pPr>
-        <w:rPr>
-          <w:lang w:val="en-US"/>
-        </w:rPr>
-      </w:pPr>
-    </w:p>
-    <w:p>
-      <w:pPr>
-        <w:pStyle w:val="a3"/>
-        <w:rPr>
-          <w:lang w:val="en-US"/>
-        </w:rPr>
-      </w:pPr>
-      <w:r>
-        <w:rPr>
-          <w:lang w:val="en-US"/>
-        </w:rPr>
-        <w:t>BCNF</w:t>
-      </w:r>
-    </w:p>
-    <w:p>
-      <w:pPr>
-        <w:rPr>
-          <w:lang w:val="en-US"/>
-        </w:rPr>
-      </w:pPr>
-      <w:r>
-        <w:rPr>
-          <w:lang w:val="en-US"/>
-        </w:rPr>
-        <w:t>////</w:t>
-      </w:r>
-    </w:p>
-    <w:p>
-      <w:pPr>
-        <w:rPr>
-          <w:lang w:val="en-US"/>
-        </w:rPr>
-      </w:pPr>
-    </w:p>
-    <w:p>
-      <w:pPr>
-        <w:rPr>
-          <w:lang w:val="en-US"/>
-        </w:rPr>
-      </w:pPr>
-    </w:p>
-    <w:p>
-      <w:pPr>
-        <w:pStyle w:val="a3"/>
-      </w:pPr>
-      <w:proofErr w:type="spellStart"/>
-      <w:r>
-        <w:t>Денормализация</w:t>
-      </w:r>
-      <w:proofErr w:type="spellEnd"/>
-    </w:p>
-    <w:p>
-      <w:r>
-        <w:t>///</w:t>
-      </w:r>
-    </w:p>
-    <w:p/>
-    <w:p>
-      <w:pPr>
-        <w:pStyle w:val="a3"/>
-      </w:pPr>
-      <w:r>
-        <w:t>Функция</w:t>
-      </w:r>
-    </w:p>
-    <w:p>
-      <w:r>
-        <w:t>///</w:t>
+        <w:t>триггер</w:t>
+      </w:r>
+    </w:p>
+    <w:p>
+      <w:pPr>
+        <w:rPr>
+          <w:rFonts w:ascii="Times New Roman" w:eastAsiaTheme="majorEastAsia" w:hAnsi="Times New Roman" w:cs="Times New Roman"/>
+          <w:color w:val="000000" w:themeColor="text1"/>
+          <w:sz w:val="32"/>
+          <w:szCs w:val="32"/>
+        </w:rPr>
+      </w:pPr>
+      <w:r>
+        <w:t xml:space="preserve">Функция реализующая проверку правильности </w:t>
+      </w:r>
+      <w:r>
+        <w:rPr>
+          <w:lang w:val="en-US"/>
+        </w:rPr>
+        <w:t>Conditions</w:t>
+      </w:r>
+      <w:r>
+        <w:t xml:space="preserve"> </w:t>
+      </w:r>
+      <w:r>
+        <w:t xml:space="preserve">и </w:t>
+      </w:r>
+      <w:r>
+        <w:rPr>
+          <w:lang w:val="en-US"/>
+        </w:rPr>
+        <w:t>Place</w:t>
+      </w:r>
+      <w:r>
+        <w:t xml:space="preserve"> </w:t>
+      </w:r>
+      <w:r>
+        <w:t>связанной с</w:t>
+      </w:r>
+      <w:r>
+        <w:t xml:space="preserve"> </w:t>
+      </w:r>
+      <w:r>
+        <w:rPr>
+          <w:lang w:val="en-US"/>
+        </w:rPr>
+        <w:t>Event</w:t>
+      </w:r>
+      <w:r>
+        <w:t xml:space="preserve"> </w:t>
+      </w:r>
+      <w:r>
+        <w:t>при добавлении или обновлении.</w:t>
+      </w:r>
+      <w:r>
+        <w:br w:type="page"/>
       </w:r>
     </w:p>
     <w:p>
@@ -3392,8 +3142,16 @@
       </w:r>
     </w:p>
     <w:p>
-      <w:r>
-        <w:t>///</w:t>
+      <w:pPr>
+        <w:tabs>
+          <w:tab w:val="left" w:pos="1163"/>
+        </w:tabs>
+      </w:pPr>
+      <w:r>
+        <w:t xml:space="preserve">Во время выполнения этой лабораторной </w:t>
+      </w:r>
+      <w:r>
+        <w:t>я узнал о том, что такое нормализация и денормализация, а также написал свою функцию и триггер к ней.</w:t>
       </w:r>
     </w:p>
     <w:p/>
@@ -5867,6 +5625,7 @@
   <w:style w:type="character" w:default="1" w:styleId="a0">
     <w:name w:val="Default Paragraph Font"/>
     <w:uiPriority w:val="1"/>
+    <w:semiHidden/>
     <w:unhideWhenUsed/>
   </w:style>
   <w:style w:type="table" w:default="1" w:styleId="a1">

</xml_diff>